<commit_message>
v1.2.0 - Add Farnsworth spacing
</commit_message>
<xml_diff>
--- a/K0WLY_CW_Keyer_Manual.docx
+++ b/K0WLY_CW_Keyer_Manual.docx
@@ -63,7 +63,7 @@
           <w:sz w:val="24"/>
           <w:szCs w:val="24"/>
         </w:rPr>
-        <w:t xml:space="preserve">Version 1.1</w:t>
+        <w:t xml:space="preserve">Version 1.2</w:t>
       </w:r>
     </w:p>
     <w:p>
@@ -208,6 +208,27 @@
           <w:szCs w:val="22"/>
         </w:rPr>
         <w:t xml:space="preserve">This work — including all firmware source code, schematic diagrams, PCB design files, and documentation — is licensed under the CERN Open Hardware Licence Version 2 – Weakly Reciprocal (CERN-OHL-W v2).</w:t>
+      </w:r>
+    </w:p>
+    <w:p>
+      <w:pPr>
+        <w:spacing w:after="120"/>
+      </w:pPr>
+      <w:r>
+        <w:t xml:space="preserve"/>
+      </w:r>
+    </w:p>
+    <w:p>
+      <w:pPr>
+        <w:spacing w:after="120"/>
+      </w:pPr>
+      <w:r>
+        <w:rPr>
+          <w:rFonts w:ascii="Arial" w:cs="Arial" w:eastAsia="Arial" w:hAnsi="Arial"/>
+          <w:sz w:val="22"/>
+          <w:szCs w:val="22"/>
+        </w:rPr>
+        <w:t xml:space="preserve">You may redistribute and modify this work and make products using it under the terms of the CERN-OHL-W v2 (https://ohwr.org/cern_ohl_w_v2.txt).</w:t>
       </w:r>
     </w:p>
     <w:p>
@@ -310,94 +331,6 @@
     </w:p>
     <w:p>
       <w:pPr>
-        <w:spacing w:after="120"/>
-      </w:pPr>
-      <w:r>
-        <w:t xml:space="preserve"/>
-      </w:r>
-    </w:p>
-    <w:p>
-      <w:pPr>
-        <w:pBdr>
-          <w:top w:val="single" w:color="CCCCCC" w:sz="4" w:space="1"/>
-        </w:pBdr>
-        <w:spacing w:before="480"/>
-        <w:jc w:val="center"/>
-      </w:pPr>
-      <w:r>
-        <w:rPr>
-          <w:rFonts w:ascii="Arial" w:cs="Arial" w:eastAsia="Arial" w:hAnsi="Arial"/>
-          <w:i/>
-          <w:iCs/>
-          <w:color w:val="2E4057"/>
-          <w:sz w:val="22"/>
-          <w:szCs w:val="22"/>
-        </w:rPr>
-        <w:t xml:space="preserve">73 de K0WLY</w:t>
-      </w:r>
-    </w:p>
-    <w:p>
-      <w:pPr>
-        <w:spacing w:after="120"/>
-      </w:pPr>
-      <w:r>
-        <w:t xml:space="preserve"/>
-      </w:r>
-    </w:p>
-    <w:p>
-      <w:pPr>
-        <w:pStyle w:val="Heading1"/>
-      </w:pPr>
-      <w:r>
-        <w:rPr>
-          <w:rFonts w:ascii="Arial" w:cs="Arial" w:eastAsia="Arial" w:hAnsi="Arial"/>
-          <w:b/>
-          <w:bCs/>
-          <w:color w:val="2E4057"/>
-          <w:sz w:val="32"/>
-          <w:szCs w:val="32"/>
-        </w:rPr>
-        <w:t xml:space="preserve">1. Overview</w:t>
-      </w:r>
-    </w:p>
-    <w:p>
-      <w:pPr>
-        <w:spacing w:after="120"/>
-      </w:pPr>
-      <w:r>
-        <w:rPr>
-          <w:rFonts w:ascii="Arial" w:cs="Arial" w:eastAsia="Arial" w:hAnsi="Arial"/>
-          <w:sz w:val="22"/>
-          <w:szCs w:val="22"/>
-        </w:rPr>
-        <w:t xml:space="preserve">The K0WLY Two-Way CW Keyer is an ESP32-S3 based iambic keyer built on the LilyGO T-Display S3 AMOLED board featuring a 1.91” 536×240 AMOLED display. It provides full iambic keying with sidetone, real-time Morse code decoding, radio keying output via optocoupler, and peer-to-peer two-way CW communication over WiFi using ESP-NOW — no router or network infrastructure required.</w:t>
-      </w:r>
-    </w:p>
-    <w:p>
-      <w:pPr>
-        <w:spacing w:after="120"/>
-      </w:pPr>
-      <w:r>
-        <w:t xml:space="preserve"/>
-      </w:r>
-    </w:p>
-    <w:p>
-      <w:pPr>
-        <w:spacing w:after="120"/>
-      </w:pPr>
-      <w:r>
-        <w:rPr>
-          <w:rFonts w:ascii="Arial" w:cs="Arial" w:eastAsia="Arial" w:hAnsi="Arial"/>
-          <w:b/>
-          <w:bCs/>
-          <w:sz w:val="22"/>
-          <w:szCs w:val="22"/>
-        </w:rPr>
-        <w:t xml:space="preserve">Key features:</w:t>
-      </w:r>
-    </w:p>
-    <w:p>
-      <w:pPr>
         <w:pStyle w:val="ListParagraph"/>
         <w:numPr>
           <w:ilvl w:val="0"/>
@@ -411,7 +344,95 @@
           <w:sz w:val="22"/>
           <w:szCs w:val="22"/>
         </w:rPr>
-        <w:t xml:space="preserve">Iambic Mode A keyer with adjustable speed (5–40 WPM)</w:t>
+        <w:t xml:space="preserve">The original project source must be acknowledged in derivative documentation</w:t>
+      </w:r>
+    </w:p>
+    <w:p>
+      <w:pPr>
+        <w:spacing w:after="120"/>
+      </w:pPr>
+      <w:r>
+        <w:t xml:space="preserve"/>
+      </w:r>
+    </w:p>
+    <w:p>
+      <w:pPr>
+        <w:pBdr>
+          <w:top w:val="single" w:color="CCCCCC" w:sz="4" w:space="1"/>
+        </w:pBdr>
+        <w:spacing w:before="480"/>
+        <w:jc w:val="center"/>
+      </w:pPr>
+      <w:r>
+        <w:rPr>
+          <w:rFonts w:ascii="Arial" w:cs="Arial" w:eastAsia="Arial" w:hAnsi="Arial"/>
+          <w:i/>
+          <w:iCs/>
+          <w:color w:val="2E4057"/>
+          <w:sz w:val="22"/>
+          <w:szCs w:val="22"/>
+        </w:rPr>
+        <w:t xml:space="preserve">73 de K0WLY</w:t>
+      </w:r>
+    </w:p>
+    <w:p>
+      <w:pPr>
+        <w:spacing w:after="120"/>
+      </w:pPr>
+      <w:r>
+        <w:t xml:space="preserve"/>
+      </w:r>
+    </w:p>
+    <w:p>
+      <w:pPr>
+        <w:pStyle w:val="Heading1"/>
+      </w:pPr>
+      <w:r>
+        <w:rPr>
+          <w:rFonts w:ascii="Arial" w:cs="Arial" w:eastAsia="Arial" w:hAnsi="Arial"/>
+          <w:b/>
+          <w:bCs/>
+          <w:color w:val="2E4057"/>
+          <w:sz w:val="32"/>
+          <w:szCs w:val="32"/>
+        </w:rPr>
+        <w:t xml:space="preserve">1. Overview</w:t>
+      </w:r>
+    </w:p>
+    <w:p>
+      <w:pPr>
+        <w:spacing w:after="120"/>
+      </w:pPr>
+      <w:r>
+        <w:rPr>
+          <w:rFonts w:ascii="Arial" w:cs="Arial" w:eastAsia="Arial" w:hAnsi="Arial"/>
+          <w:sz w:val="22"/>
+          <w:szCs w:val="22"/>
+        </w:rPr>
+        <w:t xml:space="preserve">The K0WLY Two-Way CW Keyer is an ESP32-S3 based iambic keyer built on the LilyGO T-Display S3 AMOLED board featuring a 1.91” 536×240 AMOLED display. It provides full iambic keying with sidetone, real-time Morse code decoding, radio keying output via optocoupler, and peer-to-peer two-way CW communication over WiFi using ESP-NOW — no router or network infrastructure required.</w:t>
+      </w:r>
+    </w:p>
+    <w:p>
+      <w:pPr>
+        <w:spacing w:after="120"/>
+      </w:pPr>
+      <w:r>
+        <w:t xml:space="preserve"/>
+      </w:r>
+    </w:p>
+    <w:p>
+      <w:pPr>
+        <w:spacing w:after="120"/>
+      </w:pPr>
+      <w:r>
+        <w:rPr>
+          <w:rFonts w:ascii="Arial" w:cs="Arial" w:eastAsia="Arial" w:hAnsi="Arial"/>
+          <w:b/>
+          <w:bCs/>
+          <w:sz w:val="22"/>
+          <w:szCs w:val="22"/>
+        </w:rPr>
+        <w:t xml:space="preserve">Key features:</w:t>
       </w:r>
     </w:p>
     <w:p>
@@ -429,7 +450,7 @@
           <w:sz w:val="22"/>
           <w:szCs w:val="22"/>
         </w:rPr>
-        <w:t xml:space="preserve">Straight key mode selectable via hardware switch</w:t>
+        <w:t xml:space="preserve">Iambic Mode A keyer with adjustable speed (5–40 WPM)</w:t>
       </w:r>
     </w:p>
     <w:p>
@@ -447,7 +468,7 @@
           <w:sz w:val="22"/>
           <w:szCs w:val="22"/>
         </w:rPr>
-        <w:t xml:space="preserve">Radio keying output via PC817 optocoupler — fully isolated, compatible with most transceivers</w:t>
+        <w:t xml:space="preserve">Straight key mode selectable via hardware switch</w:t>
       </w:r>
     </w:p>
     <w:p>
@@ -465,7 +486,7 @@
           <w:sz w:val="22"/>
           <w:szCs w:val="22"/>
         </w:rPr>
-        <w:t xml:space="preserve">Adjustable sidetone frequency (400–900 Hz) — each unit independent</w:t>
+        <w:t xml:space="preserve">Farnsworth spacing — two-speed CW for learning: characters at full speed, gaps at slower effective speed (4 WPM min)</w:t>
       </w:r>
     </w:p>
     <w:p>
@@ -483,7 +504,7 @@
           <w:sz w:val="22"/>
           <w:szCs w:val="22"/>
         </w:rPr>
-        <w:t xml:space="preserve">Logarithmic volume control for speaker and headphones</w:t>
+        <w:t xml:space="preserve">Radio keying output via PC817 optocoupler — fully isolated, compatible with most transceivers</w:t>
       </w:r>
     </w:p>
     <w:p>
@@ -501,7 +522,7 @@
           <w:sz w:val="22"/>
           <w:szCs w:val="22"/>
         </w:rPr>
-        <w:t xml:space="preserve">Head copy delay (0–3 seconds) for incoming characters</w:t>
+        <w:t xml:space="preserve">Adjustable sidetone frequency (400–900 Hz) — each unit independent</w:t>
       </w:r>
     </w:p>
     <w:p>
@@ -519,7 +540,25 @@
           <w:sz w:val="22"/>
           <w:szCs w:val="22"/>
         </w:rPr>
-        <w:t xml:space="preserve">Adjustable word gap spacing (off or 4–9 dits) for display readability</w:t>
+        <w:t xml:space="preserve">Logarithmic volume control for speaker and headphones</w:t>
+      </w:r>
+    </w:p>
+    <w:p>
+      <w:pPr>
+        <w:pStyle w:val="ListParagraph"/>
+        <w:numPr>
+          <w:ilvl w:val="0"/>
+          <w:numId w:val="2"/>
+        </w:numPr>
+        <w:spacing w:after="80"/>
+      </w:pPr>
+      <w:r>
+        <w:rPr>
+          <w:rFonts w:ascii="Arial" w:cs="Arial" w:eastAsia="Arial" w:hAnsi="Arial"/>
+          <w:sz w:val="22"/>
+          <w:szCs w:val="22"/>
+        </w:rPr>
+        <w:t xml:space="preserve">Head copy delay (0–3 seconds) for incoming characters</w:t>
       </w:r>
     </w:p>
     <w:p>
@@ -877,7 +916,7 @@
                 <w:sz w:val="20"/>
                 <w:szCs w:val="20"/>
               </w:rPr>
-              <w:t xml:space="preserve">WPM, Freq, Delay, Vol, GAP, SK/IAM, SOLO/DUAL</w:t>
+              <w:t xml:space="preserve">Callsign, WPM, Freq, Delay, Vol, SK/IAM, SOLO/DUAL</w:t>
             </w:r>
           </w:p>
         </w:tc>
@@ -1162,7 +1201,7 @@
                 <w:sz w:val="20"/>
                 <w:szCs w:val="20"/>
               </w:rPr>
-              <w:t xml:space="preserve">Active pot mode, current value, peer MAC, K0WLY callsign</w:t>
+              <w:t xml:space="preserve">Active pot mode, current value, peer MAC address</w:t>
             </w:r>
           </w:p>
         </w:tc>
@@ -1220,7 +1259,7 @@
           <w:sz w:val="22"/>
           <w:szCs w:val="22"/>
         </w:rPr>
-        <w:t xml:space="preserve">WPM — Current speed, highlighted yellow when selected/editing</w:t>
+        <w:t xml:space="preserve">K0WLY — Your callsign (left side, green)</w:t>
       </w:r>
     </w:p>
     <w:p>
@@ -1238,7 +1277,7 @@
           <w:sz w:val="22"/>
           <w:szCs w:val="22"/>
         </w:rPr>
-        <w:t xml:space="preserve">Hz — Sidetone frequency, highlighted cyan when selected/editing</w:t>
+        <w:t xml:space="preserve">WPM — Current speed, highlighted yellow when selected</w:t>
       </w:r>
     </w:p>
     <w:p>
@@ -1256,7 +1295,7 @@
           <w:sz w:val="22"/>
           <w:szCs w:val="22"/>
         </w:rPr>
-        <w:t xml:space="preserve">DLY — Head copy delay in seconds, highlighted orange when selected/editing</w:t>
+        <w:t xml:space="preserve">Hz — Sidetone frequency, highlighted cyan when selected</w:t>
       </w:r>
     </w:p>
     <w:p>
@@ -1274,7 +1313,7 @@
           <w:sz w:val="22"/>
           <w:szCs w:val="22"/>
         </w:rPr>
-        <w:t xml:space="preserve">VOL — Volume percentage, highlighted magenta when selected/editing</w:t>
+        <w:t xml:space="preserve">DLY — Head copy delay in seconds, highlighted orange when selected</w:t>
       </w:r>
     </w:p>
     <w:p>
@@ -1292,7 +1331,7 @@
           <w:sz w:val="22"/>
           <w:szCs w:val="22"/>
         </w:rPr>
-        <w:t xml:space="preserve">GAP — Word gap threshold (OFF or 4–9 dits), highlighted green when selected/editing</w:t>
+        <w:t xml:space="preserve">VOL — Volume percentage, highlighted magenta when selected</w:t>
       </w:r>
     </w:p>
     <w:p>
@@ -1386,44 +1425,7 @@
           <w:sz w:val="22"/>
           <w:szCs w:val="22"/>
         </w:rPr>
-        <w:t xml:space="preserve">Decoded characters scroll from right to left on each line. The TX line (green) shows characters you are sending. The RX line (cyan) shows characters received from the peer unit, subject to any head copy delay you have set. Word spaces appear between words when the GAP feature is enabled.</w:t>
-      </w:r>
-    </w:p>
-    <w:p>
-      <w:pPr>
-        <w:spacing w:after="120"/>
-      </w:pPr>
-      <w:r>
-        <w:t xml:space="preserve"/>
-      </w:r>
-    </w:p>
-    <w:p>
-      <w:pPr>
-        <w:pStyle w:val="Heading2"/>
-      </w:pPr>
-      <w:r>
-        <w:rPr>
-          <w:rFonts w:ascii="Arial" w:cs="Arial" w:eastAsia="Arial" w:hAnsi="Arial"/>
-          <w:b/>
-          <w:bCs/>
-          <w:color w:val="048A81"/>
-          <w:sz w:val="26"/>
-          <w:szCs w:val="26"/>
-        </w:rPr>
-        <w:t xml:space="preserve">2.3 Status Area</w:t>
-      </w:r>
-    </w:p>
-    <w:p>
-      <w:pPr>
-        <w:spacing w:after="120"/>
-      </w:pPr>
-      <w:r>
-        <w:rPr>
-          <w:rFonts w:ascii="Arial" w:cs="Arial" w:eastAsia="Arial" w:hAnsi="Arial"/>
-          <w:sz w:val="22"/>
-          <w:szCs w:val="22"/>
-        </w:rPr>
-        <w:t xml:space="preserve">The status area shows the currently selected pot mode label and current value. When in edit mode [EDIT] appears next to the label. The peer MAC address (or SEARCHING...) appears at the bottom left. Your callsign K0WLY appears at the bottom right.</w:t>
+        <w:t xml:space="preserve">Decoded characters scroll from right to left on each line. The TX line (green) shows characters you are sending. The RX line (cyan) shows characters received from the peer unit, subject to any head copy delay you have set.</w:t>
       </w:r>
     </w:p>
     <w:p>
@@ -2373,7 +2375,7 @@
           <w:sz w:val="22"/>
           <w:szCs w:val="22"/>
         </w:rPr>
-        <w:t xml:space="preserve">The keyer accepts a standard two-lever iambic paddle. Connect the dit lever to GPIO11 and the dah lever to GPIO10 with external 10kΩ pull-up resistors to 3.3V. The paddle contacts should close to ground.</w:t>
+        <w:t xml:space="preserve">The keyer accepts a standard two-lever iambic paddle. Connect the dit lever to GPIO11 and the dah lever to GPIO10 with external 10kΩ pull-up resistors to 3.3V on each line. The paddle contacts should close to ground.</w:t>
       </w:r>
     </w:p>
     <w:p>
@@ -2538,7 +2540,7 @@
           <w:sz w:val="22"/>
           <w:szCs w:val="22"/>
         </w:rPr>
-        <w:t xml:space="preserve">The sidetone is a PWM square wave on GPIO13 driving a 2N4401 NPN transistor.</w:t>
+        <w:t xml:space="preserve">The sidetone is a PWM square wave on GPIO13 driving a 2N4401 NPN transistor. A bi-polar electrolytic coupling capacitor is used on the headphone output only.</w:t>
       </w:r>
     </w:p>
     <w:p>
@@ -2609,7 +2611,7 @@
           <w:sz w:val="22"/>
           <w:szCs w:val="22"/>
         </w:rPr>
-        <w:t xml:space="preserve">Do NOT put a coupling capacitor in series with the speaker. It will completely block all audio.</w:t>
+        <w:t xml:space="preserve">Do NOT put a coupling capacitor in series with the speaker. It will completely block all audio. The speaker connects directly between 3.3V and the transistor collector.</w:t>
       </w:r>
     </w:p>
     <w:p>
@@ -2682,7 +2684,7 @@
           <w:sz w:val="22"/>
           <w:szCs w:val="22"/>
         </w:rPr>
-        <w:t xml:space="preserve">A SPST latching switch. Open = iambic mode. Closed (GPIO15 to GND) = straight key mode, where the dit paddle acts as a simple key-down/key-up and the dah paddle is ignored.</w:t>
+        <w:t xml:space="preserve">A SPST latching switch. Open (pulled high) = iambic mode. Closed (GPIO15 to GND) = straight key mode, where the dit paddle acts as a simple key-down/key-up and the dah paddle is ignored.</w:t>
       </w:r>
     </w:p>
     <w:p>
@@ -2793,7 +2795,7 @@
           <w:sz w:val="22"/>
           <w:szCs w:val="22"/>
         </w:rPr>
-        <w:t xml:space="preserve">All five adjustable parameters are controlled by a single potentiometer. The Pot Mode Select button cycles through parameters and activates edit mode.</w:t>
+        <w:t xml:space="preserve">All four adjustable parameters are controlled by a single potentiometer. The Pot Mode Select button cycles through parameters and activates edit mode.</w:t>
       </w:r>
     </w:p>
     <w:p>
@@ -3022,7 +3024,7 @@
                 <w:sz w:val="20"/>
                 <w:szCs w:val="20"/>
               </w:rPr>
-              <w:t xml:space="preserve">WPM → FREQ → DELAY → VOL → GAP → WPM</w:t>
+              <w:t xml:space="preserve">WPM → FREQ → DELAY → VOL → WPM</w:t>
             </w:r>
           </w:p>
         </w:tc>
@@ -3629,69 +3631,69 @@
                 <w:sz w:val="20"/>
                 <w:szCs w:val="20"/>
               </w:rPr>
-              <w:t xml:space="preserve">Frequency</w:t>
-            </w:r>
-          </w:p>
-        </w:tc>
-        <w:tc>
-          <w:tcPr>
-            <w:tcW w:type="dxa" w:w="3120"/>
-            <w:tcBorders>
-              <w:top w:val="single" w:color="CCCCCC" w:sz="1"/>
-              <w:left w:val="single" w:color="CCCCCC" w:sz="1"/>
-              <w:bottom w:val="single" w:color="CCCCCC" w:sz="1"/>
-              <w:right w:val="single" w:color="CCCCCC" w:sz="1"/>
-            </w:tcBorders>
-            <w:shd w:fill="F5F5F5" w:val="clear"/>
-            <w:tcMar>
-              <w:top w:type="dxa" w:w="80"/>
-              <w:left w:type="dxa" w:w="120"/>
-              <w:bottom w:type="dxa" w:w="80"/>
-              <w:right w:type="dxa" w:w="120"/>
-            </w:tcMar>
-          </w:tcPr>
-          <w:p>
-            <w:r>
-              <w:rPr>
-                <w:rFonts w:ascii="Arial" w:cs="Arial" w:eastAsia="Arial" w:hAnsi="Arial"/>
-                <w:b w:val="false"/>
-                <w:bCs w:val="false"/>
-                <w:color w:val="333333"/>
-                <w:sz w:val="20"/>
-                <w:szCs w:val="20"/>
-              </w:rPr>
-              <w:t xml:space="preserve">400 – 900 Hz</w:t>
-            </w:r>
-          </w:p>
-        </w:tc>
-        <w:tc>
-          <w:tcPr>
-            <w:tcW w:type="dxa" w:w="3120"/>
-            <w:tcBorders>
-              <w:top w:val="single" w:color="CCCCCC" w:sz="1"/>
-              <w:left w:val="single" w:color="CCCCCC" w:sz="1"/>
-              <w:bottom w:val="single" w:color="CCCCCC" w:sz="1"/>
-              <w:right w:val="single" w:color="CCCCCC" w:sz="1"/>
-            </w:tcBorders>
-            <w:shd w:fill="F5F5F5" w:val="clear"/>
-            <w:tcMar>
-              <w:top w:type="dxa" w:w="80"/>
-              <w:left w:type="dxa" w:w="120"/>
-              <w:bottom w:type="dxa" w:w="80"/>
-              <w:right w:type="dxa" w:w="120"/>
-            </w:tcMar>
-          </w:tcPr>
-          <w:p>
-            <w:r>
-              <w:rPr>
-                <w:rFonts w:ascii="Arial" w:cs="Arial" w:eastAsia="Arial" w:hAnsi="Arial"/>
-                <w:b w:val="false"/>
-                <w:bCs w:val="false"/>
-                <w:color w:val="333333"/>
-                <w:sz w:val="20"/>
-                <w:szCs w:val="20"/>
-              </w:rPr>
-              <w:t xml:space="preserve">Sidetone pitch, each unit independent</w:t>
+              <w:t xml:space="preserve">Char Speed</w:t>
+            </w:r>
+          </w:p>
+        </w:tc>
+        <w:tc>
+          <w:tcPr>
+            <w:tcW w:type="dxa" w:w="3120"/>
+            <w:tcBorders>
+              <w:top w:val="single" w:color="CCCCCC" w:sz="1"/>
+              <w:left w:val="single" w:color="CCCCCC" w:sz="1"/>
+              <w:bottom w:val="single" w:color="CCCCCC" w:sz="1"/>
+              <w:right w:val="single" w:color="CCCCCC" w:sz="1"/>
+            </w:tcBorders>
+            <w:shd w:fill="F5F5F5" w:val="clear"/>
+            <w:tcMar>
+              <w:top w:type="dxa" w:w="80"/>
+              <w:left w:type="dxa" w:w="120"/>
+              <w:bottom w:type="dxa" w:w="80"/>
+              <w:right w:type="dxa" w:w="120"/>
+            </w:tcMar>
+          </w:tcPr>
+          <w:p>
+            <w:r>
+              <w:rPr>
+                <w:rFonts w:ascii="Arial" w:cs="Arial" w:eastAsia="Arial" w:hAnsi="Arial"/>
+                <w:b w:val="false"/>
+                <w:bCs w:val="false"/>
+                <w:color w:val="333333"/>
+                <w:sz w:val="20"/>
+                <w:szCs w:val="20"/>
+              </w:rPr>
+              <w:t xml:space="preserve">5 – 40 WPM</w:t>
+            </w:r>
+          </w:p>
+        </w:tc>
+        <w:tc>
+          <w:tcPr>
+            <w:tcW w:type="dxa" w:w="3120"/>
+            <w:tcBorders>
+              <w:top w:val="single" w:color="CCCCCC" w:sz="1"/>
+              <w:left w:val="single" w:color="CCCCCC" w:sz="1"/>
+              <w:bottom w:val="single" w:color="CCCCCC" w:sz="1"/>
+              <w:right w:val="single" w:color="CCCCCC" w:sz="1"/>
+            </w:tcBorders>
+            <w:shd w:fill="F5F5F5" w:val="clear"/>
+            <w:tcMar>
+              <w:top w:type="dxa" w:w="80"/>
+              <w:left w:type="dxa" w:w="120"/>
+              <w:bottom w:type="dxa" w:w="80"/>
+              <w:right w:type="dxa" w:w="120"/>
+            </w:tcMar>
+          </w:tcPr>
+          <w:p>
+            <w:r>
+              <w:rPr>
+                <w:rFonts w:ascii="Arial" w:cs="Arial" w:eastAsia="Arial" w:hAnsi="Arial"/>
+                <w:b w:val="false"/>
+                <w:bCs w:val="false"/>
+                <w:color w:val="333333"/>
+                <w:sz w:val="20"/>
+                <w:szCs w:val="20"/>
+              </w:rPr>
+              <w:t xml:space="preserve">Character element speed — PARIS standard</w:t>
             </w:r>
           </w:p>
         </w:tc>
@@ -3724,69 +3726,69 @@
                 <w:sz w:val="20"/>
                 <w:szCs w:val="20"/>
               </w:rPr>
-              <w:t xml:space="preserve">Head Copy Delay</w:t>
-            </w:r>
-          </w:p>
-        </w:tc>
-        <w:tc>
-          <w:tcPr>
-            <w:tcW w:type="dxa" w:w="3120"/>
-            <w:tcBorders>
-              <w:top w:val="single" w:color="CCCCCC" w:sz="1"/>
-              <w:left w:val="single" w:color="CCCCCC" w:sz="1"/>
-              <w:bottom w:val="single" w:color="CCCCCC" w:sz="1"/>
-              <w:right w:val="single" w:color="CCCCCC" w:sz="1"/>
-            </w:tcBorders>
-            <w:shd w:fill="F5F5F5" w:val="clear"/>
-            <w:tcMar>
-              <w:top w:type="dxa" w:w="80"/>
-              <w:left w:type="dxa" w:w="120"/>
-              <w:bottom w:type="dxa" w:w="80"/>
-              <w:right w:type="dxa" w:w="120"/>
-            </w:tcMar>
-          </w:tcPr>
-          <w:p>
-            <w:r>
-              <w:rPr>
-                <w:rFonts w:ascii="Arial" w:cs="Arial" w:eastAsia="Arial" w:hAnsi="Arial"/>
-                <w:b w:val="false"/>
-                <w:bCs w:val="false"/>
-                <w:color w:val="333333"/>
-                <w:sz w:val="20"/>
-                <w:szCs w:val="20"/>
-              </w:rPr>
-              <w:t xml:space="preserve">0.0 – 3.0 sec</w:t>
-            </w:r>
-          </w:p>
-        </w:tc>
-        <w:tc>
-          <w:tcPr>
-            <w:tcW w:type="dxa" w:w="3120"/>
-            <w:tcBorders>
-              <w:top w:val="single" w:color="CCCCCC" w:sz="1"/>
-              <w:left w:val="single" w:color="CCCCCC" w:sz="1"/>
-              <w:bottom w:val="single" w:color="CCCCCC" w:sz="1"/>
-              <w:right w:val="single" w:color="CCCCCC" w:sz="1"/>
-            </w:tcBorders>
-            <w:shd w:fill="F5F5F5" w:val="clear"/>
-            <w:tcMar>
-              <w:top w:type="dxa" w:w="80"/>
-              <w:left w:type="dxa" w:w="120"/>
-              <w:bottom w:type="dxa" w:w="80"/>
-              <w:right w:type="dxa" w:w="120"/>
-            </w:tcMar>
-          </w:tcPr>
-          <w:p>
-            <w:r>
-              <w:rPr>
-                <w:rFonts w:ascii="Arial" w:cs="Arial" w:eastAsia="Arial" w:hAnsi="Arial"/>
-                <w:b w:val="false"/>
-                <w:bCs w:val="false"/>
-                <w:color w:val="333333"/>
-                <w:sz w:val="20"/>
-                <w:szCs w:val="20"/>
-              </w:rPr>
-              <w:t xml:space="preserve">Incoming char display delay, 0.1s steps</w:t>
+              <w:t xml:space="preserve">Farnsworth</w:t>
+            </w:r>
+          </w:p>
+        </w:tc>
+        <w:tc>
+          <w:tcPr>
+            <w:tcW w:type="dxa" w:w="3120"/>
+            <w:tcBorders>
+              <w:top w:val="single" w:color="CCCCCC" w:sz="1"/>
+              <w:left w:val="single" w:color="CCCCCC" w:sz="1"/>
+              <w:bottom w:val="single" w:color="CCCCCC" w:sz="1"/>
+              <w:right w:val="single" w:color="CCCCCC" w:sz="1"/>
+            </w:tcBorders>
+            <w:shd w:fill="F5F5F5" w:val="clear"/>
+            <w:tcMar>
+              <w:top w:type="dxa" w:w="80"/>
+              <w:left w:type="dxa" w:w="120"/>
+              <w:bottom w:type="dxa" w:w="80"/>
+              <w:right w:type="dxa" w:w="120"/>
+            </w:tcMar>
+          </w:tcPr>
+          <w:p>
+            <w:r>
+              <w:rPr>
+                <w:rFonts w:ascii="Arial" w:cs="Arial" w:eastAsia="Arial" w:hAnsi="Arial"/>
+                <w:b w:val="false"/>
+                <w:bCs w:val="false"/>
+                <w:color w:val="333333"/>
+                <w:sz w:val="20"/>
+                <w:szCs w:val="20"/>
+              </w:rPr>
+              <w:t xml:space="preserve">4 WPM – char speed</w:t>
+            </w:r>
+          </w:p>
+        </w:tc>
+        <w:tc>
+          <w:tcPr>
+            <w:tcW w:type="dxa" w:w="3120"/>
+            <w:tcBorders>
+              <w:top w:val="single" w:color="CCCCCC" w:sz="1"/>
+              <w:left w:val="single" w:color="CCCCCC" w:sz="1"/>
+              <w:bottom w:val="single" w:color="CCCCCC" w:sz="1"/>
+              <w:right w:val="single" w:color="CCCCCC" w:sz="1"/>
+            </w:tcBorders>
+            <w:shd w:fill="F5F5F5" w:val="clear"/>
+            <w:tcMar>
+              <w:top w:type="dxa" w:w="80"/>
+              <w:left w:type="dxa" w:w="120"/>
+              <w:bottom w:type="dxa" w:w="80"/>
+              <w:right w:type="dxa" w:w="120"/>
+            </w:tcMar>
+          </w:tcPr>
+          <w:p>
+            <w:r>
+              <w:rPr>
+                <w:rFonts w:ascii="Arial" w:cs="Arial" w:eastAsia="Arial" w:hAnsi="Arial"/>
+                <w:b w:val="false"/>
+                <w:bCs w:val="false"/>
+                <w:color w:val="333333"/>
+                <w:sz w:val="20"/>
+                <w:szCs w:val="20"/>
+              </w:rPr>
+              <w:t xml:space="preserve">Effective gap speed; equal to char speed = off</w:t>
             </w:r>
           </w:p>
         </w:tc>
@@ -3819,69 +3821,69 @@
                 <w:sz w:val="20"/>
                 <w:szCs w:val="20"/>
               </w:rPr>
-              <w:t xml:space="preserve">Volume</w:t>
-            </w:r>
-          </w:p>
-        </w:tc>
-        <w:tc>
-          <w:tcPr>
-            <w:tcW w:type="dxa" w:w="3120"/>
-            <w:tcBorders>
-              <w:top w:val="single" w:color="CCCCCC" w:sz="1"/>
-              <w:left w:val="single" w:color="CCCCCC" w:sz="1"/>
-              <w:bottom w:val="single" w:color="CCCCCC" w:sz="1"/>
-              <w:right w:val="single" w:color="CCCCCC" w:sz="1"/>
-            </w:tcBorders>
-            <w:shd w:fill="F5F5F5" w:val="clear"/>
-            <w:tcMar>
-              <w:top w:type="dxa" w:w="80"/>
-              <w:left w:type="dxa" w:w="120"/>
-              <w:bottom w:type="dxa" w:w="80"/>
-              <w:right w:type="dxa" w:w="120"/>
-            </w:tcMar>
-          </w:tcPr>
-          <w:p>
-            <w:r>
-              <w:rPr>
-                <w:rFonts w:ascii="Arial" w:cs="Arial" w:eastAsia="Arial" w:hAnsi="Arial"/>
-                <w:b w:val="false"/>
-                <w:bCs w:val="false"/>
-                <w:color w:val="333333"/>
-                <w:sz w:val="20"/>
-                <w:szCs w:val="20"/>
-              </w:rPr>
-              <w:t xml:space="preserve">0 – 100%</w:t>
-            </w:r>
-          </w:p>
-        </w:tc>
-        <w:tc>
-          <w:tcPr>
-            <w:tcW w:type="dxa" w:w="3120"/>
-            <w:tcBorders>
-              <w:top w:val="single" w:color="CCCCCC" w:sz="1"/>
-              <w:left w:val="single" w:color="CCCCCC" w:sz="1"/>
-              <w:bottom w:val="single" w:color="CCCCCC" w:sz="1"/>
-              <w:right w:val="single" w:color="CCCCCC" w:sz="1"/>
-            </w:tcBorders>
-            <w:shd w:fill="F5F5F5" w:val="clear"/>
-            <w:tcMar>
-              <w:top w:type="dxa" w:w="80"/>
-              <w:left w:type="dxa" w:w="120"/>
-              <w:bottom w:type="dxa" w:w="80"/>
-              <w:right w:type="dxa" w:w="120"/>
-            </w:tcMar>
-          </w:tcPr>
-          <w:p>
-            <w:r>
-              <w:rPr>
-                <w:rFonts w:ascii="Arial" w:cs="Arial" w:eastAsia="Arial" w:hAnsi="Arial"/>
-                <w:b w:val="false"/>
-                <w:bCs w:val="false"/>
-                <w:color w:val="333333"/>
-                <w:sz w:val="20"/>
-                <w:szCs w:val="20"/>
-              </w:rPr>
-              <w:t xml:space="preserve">Logarithmic curve, max PWM duty 78%</w:t>
+              <w:t xml:space="preserve">Frequency</w:t>
+            </w:r>
+          </w:p>
+        </w:tc>
+        <w:tc>
+          <w:tcPr>
+            <w:tcW w:type="dxa" w:w="3120"/>
+            <w:tcBorders>
+              <w:top w:val="single" w:color="CCCCCC" w:sz="1"/>
+              <w:left w:val="single" w:color="CCCCCC" w:sz="1"/>
+              <w:bottom w:val="single" w:color="CCCCCC" w:sz="1"/>
+              <w:right w:val="single" w:color="CCCCCC" w:sz="1"/>
+            </w:tcBorders>
+            <w:shd w:fill="F5F5F5" w:val="clear"/>
+            <w:tcMar>
+              <w:top w:type="dxa" w:w="80"/>
+              <w:left w:type="dxa" w:w="120"/>
+              <w:bottom w:type="dxa" w:w="80"/>
+              <w:right w:type="dxa" w:w="120"/>
+            </w:tcMar>
+          </w:tcPr>
+          <w:p>
+            <w:r>
+              <w:rPr>
+                <w:rFonts w:ascii="Arial" w:cs="Arial" w:eastAsia="Arial" w:hAnsi="Arial"/>
+                <w:b w:val="false"/>
+                <w:bCs w:val="false"/>
+                <w:color w:val="333333"/>
+                <w:sz w:val="20"/>
+                <w:szCs w:val="20"/>
+              </w:rPr>
+              <w:t xml:space="preserve">400 – 900 Hz</w:t>
+            </w:r>
+          </w:p>
+        </w:tc>
+        <w:tc>
+          <w:tcPr>
+            <w:tcW w:type="dxa" w:w="3120"/>
+            <w:tcBorders>
+              <w:top w:val="single" w:color="CCCCCC" w:sz="1"/>
+              <w:left w:val="single" w:color="CCCCCC" w:sz="1"/>
+              <w:bottom w:val="single" w:color="CCCCCC" w:sz="1"/>
+              <w:right w:val="single" w:color="CCCCCC" w:sz="1"/>
+            </w:tcBorders>
+            <w:shd w:fill="F5F5F5" w:val="clear"/>
+            <w:tcMar>
+              <w:top w:type="dxa" w:w="80"/>
+              <w:left w:type="dxa" w:w="120"/>
+              <w:bottom w:type="dxa" w:w="80"/>
+              <w:right w:type="dxa" w:w="120"/>
+            </w:tcMar>
+          </w:tcPr>
+          <w:p>
+            <w:r>
+              <w:rPr>
+                <w:rFonts w:ascii="Arial" w:cs="Arial" w:eastAsia="Arial" w:hAnsi="Arial"/>
+                <w:b w:val="false"/>
+                <w:bCs w:val="false"/>
+                <w:color w:val="333333"/>
+                <w:sz w:val="20"/>
+                <w:szCs w:val="20"/>
+              </w:rPr>
+              <w:t xml:space="preserve">Sidetone pitch, each unit independent</w:t>
             </w:r>
           </w:p>
         </w:tc>
@@ -3914,69 +3916,164 @@
                 <w:sz w:val="20"/>
                 <w:szCs w:val="20"/>
               </w:rPr>
-              <w:t xml:space="preserve">Word Gap</w:t>
-            </w:r>
-          </w:p>
-        </w:tc>
-        <w:tc>
-          <w:tcPr>
-            <w:tcW w:type="dxa" w:w="3120"/>
-            <w:tcBorders>
-              <w:top w:val="single" w:color="CCCCCC" w:sz="1"/>
-              <w:left w:val="single" w:color="CCCCCC" w:sz="1"/>
-              <w:bottom w:val="single" w:color="CCCCCC" w:sz="1"/>
-              <w:right w:val="single" w:color="CCCCCC" w:sz="1"/>
-            </w:tcBorders>
-            <w:shd w:fill="F5F5F5" w:val="clear"/>
-            <w:tcMar>
-              <w:top w:type="dxa" w:w="80"/>
-              <w:left w:type="dxa" w:w="120"/>
-              <w:bottom w:type="dxa" w:w="80"/>
-              <w:right w:type="dxa" w:w="120"/>
-            </w:tcMar>
-          </w:tcPr>
-          <w:p>
-            <w:r>
-              <w:rPr>
-                <w:rFonts w:ascii="Arial" w:cs="Arial" w:eastAsia="Arial" w:hAnsi="Arial"/>
-                <w:b w:val="false"/>
-                <w:bCs w:val="false"/>
-                <w:color w:val="333333"/>
-                <w:sz w:val="20"/>
-                <w:szCs w:val="20"/>
-              </w:rPr>
-              <w:t xml:space="preserve">OFF or 4–9 dits</w:t>
-            </w:r>
-          </w:p>
-        </w:tc>
-        <w:tc>
-          <w:tcPr>
-            <w:tcW w:type="dxa" w:w="3120"/>
-            <w:tcBorders>
-              <w:top w:val="single" w:color="CCCCCC" w:sz="1"/>
-              <w:left w:val="single" w:color="CCCCCC" w:sz="1"/>
-              <w:bottom w:val="single" w:color="CCCCCC" w:sz="1"/>
-              <w:right w:val="single" w:color="CCCCCC" w:sz="1"/>
-            </w:tcBorders>
-            <w:shd w:fill="F5F5F5" w:val="clear"/>
-            <w:tcMar>
-              <w:top w:type="dxa" w:w="80"/>
-              <w:left w:type="dxa" w:w="120"/>
-              <w:bottom w:type="dxa" w:w="80"/>
-              <w:right w:type="dxa" w:w="120"/>
-            </w:tcMar>
-          </w:tcPr>
-          <w:p>
-            <w:r>
-              <w:rPr>
-                <w:rFonts w:ascii="Arial" w:cs="Arial" w:eastAsia="Arial" w:hAnsi="Arial"/>
-                <w:b w:val="false"/>
-                <w:bCs w:val="false"/>
-                <w:color w:val="333333"/>
-                <w:sz w:val="20"/>
-                <w:szCs w:val="20"/>
-              </w:rPr>
-              <w:t xml:space="preserve">First quarter of pot = OFF, rest = 4–9</w:t>
+              <w:t xml:space="preserve">Head Copy Delay</w:t>
+            </w:r>
+          </w:p>
+        </w:tc>
+        <w:tc>
+          <w:tcPr>
+            <w:tcW w:type="dxa" w:w="3120"/>
+            <w:tcBorders>
+              <w:top w:val="single" w:color="CCCCCC" w:sz="1"/>
+              <w:left w:val="single" w:color="CCCCCC" w:sz="1"/>
+              <w:bottom w:val="single" w:color="CCCCCC" w:sz="1"/>
+              <w:right w:val="single" w:color="CCCCCC" w:sz="1"/>
+            </w:tcBorders>
+            <w:shd w:fill="F5F5F5" w:val="clear"/>
+            <w:tcMar>
+              <w:top w:type="dxa" w:w="80"/>
+              <w:left w:type="dxa" w:w="120"/>
+              <w:bottom w:type="dxa" w:w="80"/>
+              <w:right w:type="dxa" w:w="120"/>
+            </w:tcMar>
+          </w:tcPr>
+          <w:p>
+            <w:r>
+              <w:rPr>
+                <w:rFonts w:ascii="Arial" w:cs="Arial" w:eastAsia="Arial" w:hAnsi="Arial"/>
+                <w:b w:val="false"/>
+                <w:bCs w:val="false"/>
+                <w:color w:val="333333"/>
+                <w:sz w:val="20"/>
+                <w:szCs w:val="20"/>
+              </w:rPr>
+              <w:t xml:space="preserve">0.0 – 3.0 sec</w:t>
+            </w:r>
+          </w:p>
+        </w:tc>
+        <w:tc>
+          <w:tcPr>
+            <w:tcW w:type="dxa" w:w="3120"/>
+            <w:tcBorders>
+              <w:top w:val="single" w:color="CCCCCC" w:sz="1"/>
+              <w:left w:val="single" w:color="CCCCCC" w:sz="1"/>
+              <w:bottom w:val="single" w:color="CCCCCC" w:sz="1"/>
+              <w:right w:val="single" w:color="CCCCCC" w:sz="1"/>
+            </w:tcBorders>
+            <w:shd w:fill="F5F5F5" w:val="clear"/>
+            <w:tcMar>
+              <w:top w:type="dxa" w:w="80"/>
+              <w:left w:type="dxa" w:w="120"/>
+              <w:bottom w:type="dxa" w:w="80"/>
+              <w:right w:type="dxa" w:w="120"/>
+            </w:tcMar>
+          </w:tcPr>
+          <w:p>
+            <w:r>
+              <w:rPr>
+                <w:rFonts w:ascii="Arial" w:cs="Arial" w:eastAsia="Arial" w:hAnsi="Arial"/>
+                <w:b w:val="false"/>
+                <w:bCs w:val="false"/>
+                <w:color w:val="333333"/>
+                <w:sz w:val="20"/>
+                <w:szCs w:val="20"/>
+              </w:rPr>
+              <w:t xml:space="preserve">Incoming char display delay, 0.1s steps</w:t>
+            </w:r>
+          </w:p>
+        </w:tc>
+      </w:tr>
+      <w:tr>
+        <w:tc>
+          <w:tcPr>
+            <w:tcW w:type="dxa" w:w="3120"/>
+            <w:tcBorders>
+              <w:top w:val="single" w:color="CCCCCC" w:sz="1"/>
+              <w:left w:val="single" w:color="CCCCCC" w:sz="1"/>
+              <w:bottom w:val="single" w:color="CCCCCC" w:sz="1"/>
+              <w:right w:val="single" w:color="CCCCCC" w:sz="1"/>
+            </w:tcBorders>
+            <w:shd w:fill="F5F5F5" w:val="clear"/>
+            <w:tcMar>
+              <w:top w:type="dxa" w:w="80"/>
+              <w:left w:type="dxa" w:w="120"/>
+              <w:bottom w:type="dxa" w:w="80"/>
+              <w:right w:type="dxa" w:w="120"/>
+            </w:tcMar>
+          </w:tcPr>
+          <w:p>
+            <w:r>
+              <w:rPr>
+                <w:rFonts w:ascii="Arial" w:cs="Arial" w:eastAsia="Arial" w:hAnsi="Arial"/>
+                <w:b w:val="false"/>
+                <w:bCs w:val="false"/>
+                <w:color w:val="333333"/>
+                <w:sz w:val="20"/>
+                <w:szCs w:val="20"/>
+              </w:rPr>
+              <w:t xml:space="preserve">Volume</w:t>
+            </w:r>
+          </w:p>
+        </w:tc>
+        <w:tc>
+          <w:tcPr>
+            <w:tcW w:type="dxa" w:w="3120"/>
+            <w:tcBorders>
+              <w:top w:val="single" w:color="CCCCCC" w:sz="1"/>
+              <w:left w:val="single" w:color="CCCCCC" w:sz="1"/>
+              <w:bottom w:val="single" w:color="CCCCCC" w:sz="1"/>
+              <w:right w:val="single" w:color="CCCCCC" w:sz="1"/>
+            </w:tcBorders>
+            <w:shd w:fill="F5F5F5" w:val="clear"/>
+            <w:tcMar>
+              <w:top w:type="dxa" w:w="80"/>
+              <w:left w:type="dxa" w:w="120"/>
+              <w:bottom w:type="dxa" w:w="80"/>
+              <w:right w:type="dxa" w:w="120"/>
+            </w:tcMar>
+          </w:tcPr>
+          <w:p>
+            <w:r>
+              <w:rPr>
+                <w:rFonts w:ascii="Arial" w:cs="Arial" w:eastAsia="Arial" w:hAnsi="Arial"/>
+                <w:b w:val="false"/>
+                <w:bCs w:val="false"/>
+                <w:color w:val="333333"/>
+                <w:sz w:val="20"/>
+                <w:szCs w:val="20"/>
+              </w:rPr>
+              <w:t xml:space="preserve">0 – 100%</w:t>
+            </w:r>
+          </w:p>
+        </w:tc>
+        <w:tc>
+          <w:tcPr>
+            <w:tcW w:type="dxa" w:w="3120"/>
+            <w:tcBorders>
+              <w:top w:val="single" w:color="CCCCCC" w:sz="1"/>
+              <w:left w:val="single" w:color="CCCCCC" w:sz="1"/>
+              <w:bottom w:val="single" w:color="CCCCCC" w:sz="1"/>
+              <w:right w:val="single" w:color="CCCCCC" w:sz="1"/>
+            </w:tcBorders>
+            <w:shd w:fill="F5F5F5" w:val="clear"/>
+            <w:tcMar>
+              <w:top w:type="dxa" w:w="80"/>
+              <w:left w:type="dxa" w:w="120"/>
+              <w:bottom w:type="dxa" w:w="80"/>
+              <w:right w:type="dxa" w:w="120"/>
+            </w:tcMar>
+          </w:tcPr>
+          <w:p>
+            <w:r>
+              <w:rPr>
+                <w:rFonts w:ascii="Arial" w:cs="Arial" w:eastAsia="Arial" w:hAnsi="Arial"/>
+                <w:b w:val="false"/>
+                <w:bCs w:val="false"/>
+                <w:color w:val="333333"/>
+                <w:sz w:val="20"/>
+                <w:szCs w:val="20"/>
+              </w:rPr>
+              <w:t xml:space="preserve">Logarithmic curve, max PWM duty 78%</w:t>
             </w:r>
           </w:p>
         </w:tc>
@@ -3988,6 +4085,22 @@
       </w:pPr>
       <w:r>
         <w:t xml:space="preserve"/>
+      </w:r>
+    </w:p>
+    <w:p>
+      <w:pPr>
+        <w:pStyle w:val="Heading1"/>
+      </w:pPr>
+      <w:r>
+        <w:rPr>
+          <w:rFonts w:ascii="Arial" w:cs="Arial" w:eastAsia="Arial" w:hAnsi="Arial"/>
+          <w:b/>
+          <w:bCs/>
+          <w:color w:val="2E4057"/>
+          <w:sz w:val="32"/>
+          <w:szCs w:val="32"/>
+        </w:rPr>
+        <w:t xml:space="preserve">5. WiFi Peer-to-Peer Operation</w:t>
       </w:r>
     </w:p>
     <w:p>
@@ -4003,7 +4116,7 @@
           <w:sz w:val="26"/>
           <w:szCs w:val="26"/>
         </w:rPr>
-        <w:t xml:space="preserve">4.4 Word Gap Setting</w:t>
+        <w:t xml:space="preserve">5.1 Auto-Discovery</w:t>
       </w:r>
     </w:p>
     <w:p>
@@ -4016,7 +4129,7 @@
           <w:sz w:val="22"/>
           <w:szCs w:val="22"/>
         </w:rPr>
-        <w:t xml:space="preserve">The word gap setting controls whether spaces are automatically inserted between words on the TX and RX display lines. When set to OFF no spaces are inserted. When set to 4–9, the keyer waits that many total dits of silence after a character before inserting a space.</w:t>
+        <w:t xml:space="preserve">The keyer uses ESP-NOW for direct peer-to-peer communication without a WiFi router. On power-up each unit broadcasts a discovery packet every 2 seconds. When a peer responds the header shows DUAL in green and the peer MAC appears in the status area.</w:t>
       </w:r>
     </w:p>
     <w:p>
@@ -4025,132 +4138,6 @@
       </w:pPr>
       <w:r>
         <w:t xml:space="preserve"/>
-      </w:r>
-    </w:p>
-    <w:p>
-      <w:pPr>
-        <w:spacing w:after="120"/>
-      </w:pPr>
-      <w:r>
-        <w:rPr>
-          <w:rFonts w:ascii="Arial" w:cs="Arial" w:eastAsia="Arial" w:hAnsi="Arial"/>
-          <w:sz w:val="22"/>
-          <w:szCs w:val="22"/>
-        </w:rPr>
-        <w:t xml:space="preserve">Choosing the right gap threshold:</w:t>
-      </w:r>
-    </w:p>
-    <w:p>
-      <w:pPr>
-        <w:pStyle w:val="ListParagraph"/>
-        <w:numPr>
-          <w:ilvl w:val="0"/>
-          <w:numId w:val="2"/>
-        </w:numPr>
-        <w:spacing w:after="80"/>
-      </w:pPr>
-      <w:r>
-        <w:rPr>
-          <w:rFonts w:ascii="Arial" w:cs="Arial" w:eastAsia="Arial" w:hAnsi="Arial"/>
-          <w:sz w:val="22"/>
-          <w:szCs w:val="22"/>
-        </w:rPr>
-        <w:t xml:space="preserve">4–5 dits — good for faster, consistent sending (20+ WPM)</w:t>
-      </w:r>
-    </w:p>
-    <w:p>
-      <w:pPr>
-        <w:pStyle w:val="ListParagraph"/>
-        <w:numPr>
-          <w:ilvl w:val="0"/>
-          <w:numId w:val="2"/>
-        </w:numPr>
-        <w:spacing w:after="80"/>
-      </w:pPr>
-      <w:r>
-        <w:rPr>
-          <w:rFonts w:ascii="Arial" w:cs="Arial" w:eastAsia="Arial" w:hAnsi="Arial"/>
-          <w:sz w:val="22"/>
-          <w:szCs w:val="22"/>
-        </w:rPr>
-        <w:t xml:space="preserve">6–7 dits — standard ITU word gap, works well for most operators</w:t>
-      </w:r>
-    </w:p>
-    <w:p>
-      <w:pPr>
-        <w:pStyle w:val="ListParagraph"/>
-        <w:numPr>
-          <w:ilvl w:val="0"/>
-          <w:numId w:val="2"/>
-        </w:numPr>
-        <w:spacing w:after="80"/>
-      </w:pPr>
-      <w:r>
-        <w:rPr>
-          <w:rFonts w:ascii="Arial" w:cs="Arial" w:eastAsia="Arial" w:hAnsi="Arial"/>
-          <w:sz w:val="22"/>
-          <w:szCs w:val="22"/>
-        </w:rPr>
-        <w:t xml:space="preserve">8–9 dits — more forgiving for slower or less consistent senders</w:t>
-      </w:r>
-    </w:p>
-    <w:p>
-      <w:pPr>
-        <w:spacing w:after="120"/>
-      </w:pPr>
-      <w:r>
-        <w:t xml:space="preserve"/>
-      </w:r>
-    </w:p>
-    <w:p>
-      <w:pPr>
-        <w:spacing w:after="80" w:before="80"/>
-        <w:ind w:left="360"/>
-      </w:pPr>
-      <w:r>
-        <w:rPr>
-          <w:rFonts w:ascii="Arial" w:cs="Arial" w:eastAsia="Arial" w:hAnsi="Arial"/>
-          <w:b/>
-          <w:bCs/>
-          <w:color w:val="C0392B"/>
-          <w:sz w:val="22"/>
-          <w:szCs w:val="22"/>
-        </w:rPr>
-        <w:t xml:space="preserve">NOTE: </w:t>
-      </w:r>
-      <w:r>
-        <w:rPr>
-          <w:rFonts w:ascii="Arial" w:cs="Arial" w:eastAsia="Arial" w:hAnsi="Arial"/>
-          <w:i/>
-          <w:iCs/>
-          <w:sz w:val="22"/>
-          <w:szCs w:val="22"/>
-        </w:rPr>
-        <w:t xml:space="preserve">If you see spurious spaces appearing within words, increase the gap threshold. If word spaces are missing, decrease it.</w:t>
-      </w:r>
-    </w:p>
-    <w:p>
-      <w:pPr>
-        <w:spacing w:after="120"/>
-      </w:pPr>
-      <w:r>
-        <w:t xml:space="preserve"/>
-      </w:r>
-    </w:p>
-    <w:p>
-      <w:pPr>
-        <w:pStyle w:val="Heading1"/>
-      </w:pPr>
-      <w:r>
-        <w:rPr>
-          <w:rFonts w:ascii="Arial" w:cs="Arial" w:eastAsia="Arial" w:hAnsi="Arial"/>
-          <w:b/>
-          <w:bCs/>
-          <w:color w:val="2E4057"/>
-          <w:sz w:val="32"/>
-          <w:szCs w:val="32"/>
-        </w:rPr>
-        <w:t xml:space="preserve">5. WiFi Peer-to-Peer Operation</w:t>
       </w:r>
     </w:p>
     <w:p>
@@ -4166,7 +4153,7 @@
           <w:sz w:val="26"/>
           <w:szCs w:val="26"/>
         </w:rPr>
-        <w:t xml:space="preserve">5.1 Auto-Discovery</w:t>
+        <w:t xml:space="preserve">5.2 Transmitting to Peer</w:t>
       </w:r>
     </w:p>
     <w:p>
@@ -4179,7 +4166,7 @@
           <w:sz w:val="22"/>
           <w:szCs w:val="22"/>
         </w:rPr>
-        <w:t xml:space="preserve">The keyer uses ESP-NOW for direct peer-to-peer communication without a WiFi router. On power-up each unit broadcasts a discovery packet every 2 seconds. When a peer responds the header shows DUAL in green and the peer MAC appears in the status area.</w:t>
+        <w:t xml:space="preserve">Every element keyed (dit or dah) transmits to the peer unit in real time. The peer plays back each element at its own locally set sidetone frequency. Each operator always hears code at their own preferred pitch, completely independent of the other station's setting. Decoded characters also transmit and appear on the peer's RX line.</w:t>
       </w:r>
     </w:p>
     <w:p>
@@ -4203,7 +4190,7 @@
           <w:sz w:val="26"/>
           <w:szCs w:val="26"/>
         </w:rPr>
-        <w:t xml:space="preserve">5.2 Transmitting to Peer</w:t>
+        <w:t xml:space="preserve">5.3 Independent Sidetone Frequency</w:t>
       </w:r>
     </w:p>
     <w:p>
@@ -4216,44 +4203,7 @@
           <w:sz w:val="22"/>
           <w:szCs w:val="22"/>
         </w:rPr>
-        <w:t xml:space="preserve">Every element keyed (dit or dah) transmits to the peer unit in real time. The peer plays back each element at its own locally set sidetone frequency. Decoded characters also transmit and appear on the peer's RX line, subject to the peer's head copy delay setting.</w:t>
-      </w:r>
-    </w:p>
-    <w:p>
-      <w:pPr>
-        <w:spacing w:after="120"/>
-      </w:pPr>
-      <w:r>
-        <w:t xml:space="preserve"/>
-      </w:r>
-    </w:p>
-    <w:p>
-      <w:pPr>
-        <w:pStyle w:val="Heading2"/>
-      </w:pPr>
-      <w:r>
-        <w:rPr>
-          <w:rFonts w:ascii="Arial" w:cs="Arial" w:eastAsia="Arial" w:hAnsi="Arial"/>
-          <w:b/>
-          <w:bCs/>
-          <w:color w:val="048A81"/>
-          <w:sz w:val="26"/>
-          <w:szCs w:val="26"/>
-        </w:rPr>
-        <w:t xml:space="preserve">5.3 Independent Sidetone Frequency</w:t>
-      </w:r>
-    </w:p>
-    <w:p>
-      <w:pPr>
-        <w:spacing w:after="120"/>
-      </w:pPr>
-      <w:r>
-        <w:rPr>
-          <w:rFonts w:ascii="Arial" w:cs="Arial" w:eastAsia="Arial" w:hAnsi="Arial"/>
-          <w:sz w:val="22"/>
-          <w:szCs w:val="22"/>
-        </w:rPr>
-        <w:t xml:space="preserve">Each unit plays all CW — both sent and received — at its own locally configured sidetone frequency. If one unit is set to 550 Hz and the other to 700 Hz, each operator hears everything at their own pitch, independent of the other station.</w:t>
+        <w:t xml:space="preserve">Each unit plays all CW — both sent and received — at its own locally configured sidetone frequency. If one unit is set to 550 Hz and the other to 700 Hz, each operator hears everything at their own pitch. This is exactly how real CW operation works — each operator sets their sidetone to their personal preference, independent of the other station.</w:t>
       </w:r>
     </w:p>
     <w:p>
@@ -5098,7 +5048,7 @@
                 <w:sz w:val="20"/>
                 <w:szCs w:val="20"/>
               </w:rPr>
-              <w:t xml:space="preserve">Word gap (ITU)</w:t>
+              <w:t xml:space="preserve">Word gap</w:t>
             </w:r>
           </w:p>
         </w:tc>
@@ -5522,70 +5472,6 @@
                 <w:szCs w:val="20"/>
               </w:rPr>
               <w:t xml:space="preserve">50%</w:t>
-            </w:r>
-          </w:p>
-        </w:tc>
-      </w:tr>
-      <w:tr>
-        <w:tc>
-          <w:tcPr>
-            <w:tcW w:type="dxa" w:w="3000"/>
-            <w:tcBorders>
-              <w:top w:val="single" w:color="CCCCCC" w:sz="1"/>
-              <w:left w:val="single" w:color="CCCCCC" w:sz="1"/>
-              <w:bottom w:val="single" w:color="CCCCCC" w:sz="1"/>
-              <w:right w:val="single" w:color="CCCCCC" w:sz="1"/>
-            </w:tcBorders>
-            <w:shd w:fill="F9F9F9" w:val="clear"/>
-            <w:tcMar>
-              <w:top w:type="dxa" w:w="80"/>
-              <w:left w:type="dxa" w:w="120"/>
-              <w:bottom w:type="dxa" w:w="80"/>
-              <w:right w:type="dxa" w:w="120"/>
-            </w:tcMar>
-          </w:tcPr>
-          <w:p>
-            <w:r>
-              <w:rPr>
-                <w:rFonts w:ascii="Arial" w:cs="Arial" w:eastAsia="Arial" w:hAnsi="Arial"/>
-                <w:b w:val="false"/>
-                <w:bCs w:val="false"/>
-                <w:color w:val="333333"/>
-                <w:sz w:val="20"/>
-                <w:szCs w:val="20"/>
-              </w:rPr>
-              <w:t xml:space="preserve">Word Gap</w:t>
-            </w:r>
-          </w:p>
-        </w:tc>
-        <w:tc>
-          <w:tcPr>
-            <w:tcW w:type="dxa" w:w="6360"/>
-            <w:tcBorders>
-              <w:top w:val="single" w:color="CCCCCC" w:sz="1"/>
-              <w:left w:val="single" w:color="CCCCCC" w:sz="1"/>
-              <w:bottom w:val="single" w:color="CCCCCC" w:sz="1"/>
-              <w:right w:val="single" w:color="CCCCCC" w:sz="1"/>
-            </w:tcBorders>
-            <w:shd w:fill="F9F9F9" w:val="clear"/>
-            <w:tcMar>
-              <w:top w:type="dxa" w:w="80"/>
-              <w:left w:type="dxa" w:w="120"/>
-              <w:bottom w:type="dxa" w:w="80"/>
-              <w:right w:type="dxa" w:w="120"/>
-            </w:tcMar>
-          </w:tcPr>
-          <w:p>
-            <w:r>
-              <w:rPr>
-                <w:rFonts w:ascii="Arial" w:cs="Arial" w:eastAsia="Arial" w:hAnsi="Arial"/>
-                <w:b w:val="false"/>
-                <w:bCs w:val="false"/>
-                <w:color w:val="333333"/>
-                <w:sz w:val="20"/>
-                <w:szCs w:val="20"/>
-              </w:rPr>
-              <w:t xml:space="preserve">OFF</w:t>
             </w:r>
           </w:p>
         </w:tc>
@@ -7231,38 +7117,38 @@
                 <w:sz w:val="20"/>
                 <w:szCs w:val="20"/>
               </w:rPr>
-              <w:t xml:space="preserve">NVS version update</w:t>
-            </w:r>
-          </w:p>
-        </w:tc>
-        <w:tc>
-          <w:tcPr>
-            <w:tcW w:type="dxa" w:w="3120"/>
-            <w:tcBorders>
-              <w:top w:val="single" w:color="CCCCCC" w:sz="1"/>
-              <w:left w:val="single" w:color="CCCCCC" w:sz="1"/>
-              <w:bottom w:val="single" w:color="CCCCCC" w:sz="1"/>
-              <w:right w:val="single" w:color="CCCCCC" w:sz="1"/>
-            </w:tcBorders>
-            <w:shd w:fill="F5F5F5" w:val="clear"/>
-            <w:tcMar>
-              <w:top w:type="dxa" w:w="80"/>
-              <w:left w:type="dxa" w:w="120"/>
-              <w:bottom w:type="dxa" w:w="80"/>
-              <w:right w:type="dxa" w:w="120"/>
-            </w:tcMar>
-          </w:tcPr>
-          <w:p>
-            <w:r>
-              <w:rPr>
-                <w:rFonts w:ascii="Arial" w:cs="Arial" w:eastAsia="Arial" w:hAnsi="Arial"/>
-                <w:b w:val="false"/>
-                <w:bCs w:val="false"/>
-                <w:color w:val="333333"/>
-                <w:sz w:val="20"/>
-                <w:szCs w:val="20"/>
-              </w:rPr>
-              <w:t xml:space="preserve">Normal on first boot after firmware update</w:t>
+              <w:t xml:space="preserve">NVS issue</w:t>
+            </w:r>
+          </w:p>
+        </w:tc>
+        <w:tc>
+          <w:tcPr>
+            <w:tcW w:type="dxa" w:w="3120"/>
+            <w:tcBorders>
+              <w:top w:val="single" w:color="CCCCCC" w:sz="1"/>
+              <w:left w:val="single" w:color="CCCCCC" w:sz="1"/>
+              <w:bottom w:val="single" w:color="CCCCCC" w:sz="1"/>
+              <w:right w:val="single" w:color="CCCCCC" w:sz="1"/>
+            </w:tcBorders>
+            <w:shd w:fill="F5F5F5" w:val="clear"/>
+            <w:tcMar>
+              <w:top w:type="dxa" w:w="80"/>
+              <w:left w:type="dxa" w:w="120"/>
+              <w:bottom w:type="dxa" w:w="80"/>
+              <w:right w:type="dxa" w:w="120"/>
+            </w:tcMar>
+          </w:tcPr>
+          <w:p>
+            <w:r>
+              <w:rPr>
+                <w:rFonts w:ascii="Arial" w:cs="Arial" w:eastAsia="Arial" w:hAnsi="Arial"/>
+                <w:b w:val="false"/>
+                <w:bCs w:val="false"/>
+                <w:color w:val="333333"/>
+                <w:sz w:val="20"/>
+                <w:szCs w:val="20"/>
+              </w:rPr>
+              <w:t xml:space="preserve">Exit edit mode after adjusting</w:t>
             </w:r>
           </w:p>
         </w:tc>
@@ -7548,196 +7434,6 @@
                 <w:szCs w:val="20"/>
               </w:rPr>
               <w:t xml:space="preserve">Check firmware and GPIO12 wiring</w:t>
-            </w:r>
-          </w:p>
-        </w:tc>
-      </w:tr>
-      <w:tr>
-        <w:tc>
-          <w:tcPr>
-            <w:tcW w:type="dxa" w:w="3120"/>
-            <w:tcBorders>
-              <w:top w:val="single" w:color="CCCCCC" w:sz="1"/>
-              <w:left w:val="single" w:color="CCCCCC" w:sz="1"/>
-              <w:bottom w:val="single" w:color="CCCCCC" w:sz="1"/>
-              <w:right w:val="single" w:color="CCCCCC" w:sz="1"/>
-            </w:tcBorders>
-            <w:shd w:fill="F5F5F5" w:val="clear"/>
-            <w:tcMar>
-              <w:top w:type="dxa" w:w="80"/>
-              <w:left w:type="dxa" w:w="120"/>
-              <w:bottom w:type="dxa" w:w="80"/>
-              <w:right w:type="dxa" w:w="120"/>
-            </w:tcMar>
-          </w:tcPr>
-          <w:p>
-            <w:r>
-              <w:rPr>
-                <w:rFonts w:ascii="Arial" w:cs="Arial" w:eastAsia="Arial" w:hAnsi="Arial"/>
-                <w:b w:val="false"/>
-                <w:bCs w:val="false"/>
-                <w:color w:val="333333"/>
-                <w:sz w:val="20"/>
-                <w:szCs w:val="20"/>
-              </w:rPr>
-              <w:t xml:space="preserve">Spaces within words</w:t>
-            </w:r>
-          </w:p>
-        </w:tc>
-        <w:tc>
-          <w:tcPr>
-            <w:tcW w:type="dxa" w:w="3120"/>
-            <w:tcBorders>
-              <w:top w:val="single" w:color="CCCCCC" w:sz="1"/>
-              <w:left w:val="single" w:color="CCCCCC" w:sz="1"/>
-              <w:bottom w:val="single" w:color="CCCCCC" w:sz="1"/>
-              <w:right w:val="single" w:color="CCCCCC" w:sz="1"/>
-            </w:tcBorders>
-            <w:shd w:fill="F5F5F5" w:val="clear"/>
-            <w:tcMar>
-              <w:top w:type="dxa" w:w="80"/>
-              <w:left w:type="dxa" w:w="120"/>
-              <w:bottom w:type="dxa" w:w="80"/>
-              <w:right w:type="dxa" w:w="120"/>
-            </w:tcMar>
-          </w:tcPr>
-          <w:p>
-            <w:r>
-              <w:rPr>
-                <w:rFonts w:ascii="Arial" w:cs="Arial" w:eastAsia="Arial" w:hAnsi="Arial"/>
-                <w:b w:val="false"/>
-                <w:bCs w:val="false"/>
-                <w:color w:val="333333"/>
-                <w:sz w:val="20"/>
-                <w:szCs w:val="20"/>
-              </w:rPr>
-              <w:t xml:space="preserve">GAP threshold too low</w:t>
-            </w:r>
-          </w:p>
-        </w:tc>
-        <w:tc>
-          <w:tcPr>
-            <w:tcW w:type="dxa" w:w="3120"/>
-            <w:tcBorders>
-              <w:top w:val="single" w:color="CCCCCC" w:sz="1"/>
-              <w:left w:val="single" w:color="CCCCCC" w:sz="1"/>
-              <w:bottom w:val="single" w:color="CCCCCC" w:sz="1"/>
-              <w:right w:val="single" w:color="CCCCCC" w:sz="1"/>
-            </w:tcBorders>
-            <w:shd w:fill="F5F5F5" w:val="clear"/>
-            <w:tcMar>
-              <w:top w:type="dxa" w:w="80"/>
-              <w:left w:type="dxa" w:w="120"/>
-              <w:bottom w:type="dxa" w:w="80"/>
-              <w:right w:type="dxa" w:w="120"/>
-            </w:tcMar>
-          </w:tcPr>
-          <w:p>
-            <w:r>
-              <w:rPr>
-                <w:rFonts w:ascii="Arial" w:cs="Arial" w:eastAsia="Arial" w:hAnsi="Arial"/>
-                <w:b w:val="false"/>
-                <w:bCs w:val="false"/>
-                <w:color w:val="333333"/>
-                <w:sz w:val="20"/>
-                <w:szCs w:val="20"/>
-              </w:rPr>
-              <w:t xml:space="preserve">Increase GAP setting or set to OFF</w:t>
-            </w:r>
-          </w:p>
-        </w:tc>
-      </w:tr>
-      <w:tr>
-        <w:tc>
-          <w:tcPr>
-            <w:tcW w:type="dxa" w:w="3120"/>
-            <w:tcBorders>
-              <w:top w:val="single" w:color="CCCCCC" w:sz="1"/>
-              <w:left w:val="single" w:color="CCCCCC" w:sz="1"/>
-              <w:bottom w:val="single" w:color="CCCCCC" w:sz="1"/>
-              <w:right w:val="single" w:color="CCCCCC" w:sz="1"/>
-            </w:tcBorders>
-            <w:shd w:fill="F5F5F5" w:val="clear"/>
-            <w:tcMar>
-              <w:top w:type="dxa" w:w="80"/>
-              <w:left w:type="dxa" w:w="120"/>
-              <w:bottom w:type="dxa" w:w="80"/>
-              <w:right w:type="dxa" w:w="120"/>
-            </w:tcMar>
-          </w:tcPr>
-          <w:p>
-            <w:r>
-              <w:rPr>
-                <w:rFonts w:ascii="Arial" w:cs="Arial" w:eastAsia="Arial" w:hAnsi="Arial"/>
-                <w:b w:val="false"/>
-                <w:bCs w:val="false"/>
-                <w:color w:val="333333"/>
-                <w:sz w:val="20"/>
-                <w:szCs w:val="20"/>
-              </w:rPr>
-              <w:t xml:space="preserve">No spaces between words</w:t>
-            </w:r>
-          </w:p>
-        </w:tc>
-        <w:tc>
-          <w:tcPr>
-            <w:tcW w:type="dxa" w:w="3120"/>
-            <w:tcBorders>
-              <w:top w:val="single" w:color="CCCCCC" w:sz="1"/>
-              <w:left w:val="single" w:color="CCCCCC" w:sz="1"/>
-              <w:bottom w:val="single" w:color="CCCCCC" w:sz="1"/>
-              <w:right w:val="single" w:color="CCCCCC" w:sz="1"/>
-            </w:tcBorders>
-            <w:shd w:fill="F5F5F5" w:val="clear"/>
-            <w:tcMar>
-              <w:top w:type="dxa" w:w="80"/>
-              <w:left w:type="dxa" w:w="120"/>
-              <w:bottom w:type="dxa" w:w="80"/>
-              <w:right w:type="dxa" w:w="120"/>
-            </w:tcMar>
-          </w:tcPr>
-          <w:p>
-            <w:r>
-              <w:rPr>
-                <w:rFonts w:ascii="Arial" w:cs="Arial" w:eastAsia="Arial" w:hAnsi="Arial"/>
-                <w:b w:val="false"/>
-                <w:bCs w:val="false"/>
-                <w:color w:val="333333"/>
-                <w:sz w:val="20"/>
-                <w:szCs w:val="20"/>
-              </w:rPr>
-              <w:t xml:space="preserve">GAP set to OFF</w:t>
-            </w:r>
-          </w:p>
-        </w:tc>
-        <w:tc>
-          <w:tcPr>
-            <w:tcW w:type="dxa" w:w="3120"/>
-            <w:tcBorders>
-              <w:top w:val="single" w:color="CCCCCC" w:sz="1"/>
-              <w:left w:val="single" w:color="CCCCCC" w:sz="1"/>
-              <w:bottom w:val="single" w:color="CCCCCC" w:sz="1"/>
-              <w:right w:val="single" w:color="CCCCCC" w:sz="1"/>
-            </w:tcBorders>
-            <w:shd w:fill="F5F5F5" w:val="clear"/>
-            <w:tcMar>
-              <w:top w:type="dxa" w:w="80"/>
-              <w:left w:type="dxa" w:w="120"/>
-              <w:bottom w:type="dxa" w:w="80"/>
-              <w:right w:type="dxa" w:w="120"/>
-            </w:tcMar>
-          </w:tcPr>
-          <w:p>
-            <w:r>
-              <w:rPr>
-                <w:rFonts w:ascii="Arial" w:cs="Arial" w:eastAsia="Arial" w:hAnsi="Arial"/>
-                <w:b w:val="false"/>
-                <w:bCs w:val="false"/>
-                <w:color w:val="333333"/>
-                <w:sz w:val="20"/>
-                <w:szCs w:val="20"/>
-              </w:rPr>
-              <w:t xml:space="preserve">Enable GAP and adjust threshold</w:t>
             </w:r>
           </w:p>
         </w:tc>
@@ -9851,7 +9547,7 @@
           <w:sz w:val="18"/>
           <w:szCs w:val="18"/>
         </w:rPr>
-        <w:t xml:space="preserve">K0WLY Two-Way CW Keyer — Preliminary Manual v1.1</w:t>
+        <w:t xml:space="preserve">K0WLY Two-Way CW Keyer — Preliminary Manual v1.2</w:t>
       </w:r>
     </w:p>
     <w:p>

</xml_diff>